<commit_message>
deleted:    .alpackages/Microsoft_Application_14.0.29537.0.app 	new file:   .alpackages/Microsoft_Application_18.4.28601.29356.app 	new file:   .alpackages/Microsoft_Application_19.3.34541.35210.app 	new file:   .alpackages/Microsoft_Application_19.4.35398.36119.app 	new file:   .alpackages/Microsoft_Application_20.0.37253.38362.app 	new file:   .alpackages/Microsoft_Base Application_18.4.28601.29726.app 	new file:   .alpackages/Microsoft_Base Application_19.3.34541.36322.app 	new file:   .alpackages/Microsoft_Base Application_19.4.35398.36603.app 	new file:   .alpackages/Microsoft_Base Application_20.0.37253.40253.app
</commit_message>
<xml_diff>
--- a/Layouts/Contract Garage.docx
+++ b/Layouts/Contract Garage.docx
@@ -54,12 +54,12 @@
             <w:rFonts w:ascii="Arial" w:hAnsi="Arial" w:cs="Arial"/>
           </w:rPr>
           <w:alias w:val="#Nav: /LeaseContract_A9/Landlord"/>
-          <w:tag w:val="#Nav: SVA Contract Garage/50011"/>
+          <w:tag w:val="#Nav: SVA_Contract_Garage/50011"/>
           <w:id w:val="1753089045"/>
           <w:placeholder>
             <w:docPart w:val="DefaultPlaceholder_-1854013440"/>
           </w:placeholder>
-          <w:dataBinding w:prefixMappings="xmlns:ns0='urn:microsoft-dynamics-nav/reports/SVA Contract Garage/50011/'" w:xpath="/ns0:NavWordReportXmlPart[1]/ns0:LeaseContract_A9[1]/ns0:Landlord[1]" w:storeItemID="{1F734DEE-4130-4E5F-85C0-9541FA96340C}"/>
+          <w:dataBinding w:prefixMappings="xmlns:ns0='urn:microsoft-dynamics-nav/reports/SVA_Contract_Garage/50011/'" w:xpath="/ns0:NavWordReportXmlPart[1]/ns0:LeaseContract_A9[1]/ns0:Landlord[1]" w:storeItemID="{1F734DEE-4130-4E5F-85C0-9541FA96340C}"/>
           <w:text/>
         </w:sdtPr>
         <w:sdtEndPr/>
@@ -91,12 +91,12 @@
             <w:rFonts w:ascii="Arial" w:hAnsi="Arial" w:cs="Arial"/>
           </w:rPr>
           <w:alias w:val="#Nav: /LeaseContract_A9/LandlordCVR"/>
-          <w:tag w:val="#Nav: SVA Contract Garage/50011"/>
+          <w:tag w:val="#Nav: SVA_Contract_Garage/50011"/>
           <w:id w:val="-515149574"/>
           <w:placeholder>
             <w:docPart w:val="DefaultPlaceholder_-1854013440"/>
           </w:placeholder>
-          <w:dataBinding w:prefixMappings="xmlns:ns0='urn:microsoft-dynamics-nav/reports/SVA Contract Garage/50011/'" w:xpath="/ns0:NavWordReportXmlPart[1]/ns0:LeaseContract_A9[1]/ns0:LandlordCVR[1]" w:storeItemID="{1F734DEE-4130-4E5F-85C0-9541FA96340C}"/>
+          <w:dataBinding w:prefixMappings="xmlns:ns0='urn:microsoft-dynamics-nav/reports/SVA_Contract_Garage/50011/'" w:xpath="/ns0:NavWordReportXmlPart[1]/ns0:LeaseContract_A9[1]/ns0:LandlordCVR[1]" w:storeItemID="{1F734DEE-4130-4E5F-85C0-9541FA96340C}"/>
           <w:text/>
         </w:sdtPr>
         <w:sdtEndPr/>
@@ -132,12 +132,12 @@
             <w:rFonts w:ascii="Arial" w:hAnsi="Arial" w:cs="Arial"/>
           </w:rPr>
           <w:alias w:val="#Nav: /LeaseContract_A9/LandlordAddress"/>
-          <w:tag w:val="#Nav: SVA Contract Garage/50011"/>
+          <w:tag w:val="#Nav: SVA_Contract_Garage/50011"/>
           <w:id w:val="-363515608"/>
           <w:placeholder>
             <w:docPart w:val="DefaultPlaceholder_-1854013440"/>
           </w:placeholder>
-          <w:dataBinding w:prefixMappings="xmlns:ns0='urn:microsoft-dynamics-nav/reports/SVA Contract Garage/50011/'" w:xpath="/ns0:NavWordReportXmlPart[1]/ns0:LeaseContract_A9[1]/ns0:LandlordAddress[1]" w:storeItemID="{1F734DEE-4130-4E5F-85C0-9541FA96340C}"/>
+          <w:dataBinding w:prefixMappings="xmlns:ns0='urn:microsoft-dynamics-nav/reports/SVA_Contract_Garage/50011/'" w:xpath="/ns0:NavWordReportXmlPart[1]/ns0:LeaseContract_A9[1]/ns0:LandlordAddress[1]" w:storeItemID="{1F734DEE-4130-4E5F-85C0-9541FA96340C}"/>
           <w:text/>
         </w:sdtPr>
         <w:sdtEndPr/>
@@ -191,12 +191,12 @@
             <w:rFonts w:ascii="Arial" w:hAnsi="Arial" w:cs="Arial"/>
           </w:rPr>
           <w:alias w:val="#Nav: /LeaseContract_A9/OName"/>
-          <w:tag w:val="#Nav: SVA Contract Garage/50011"/>
+          <w:tag w:val="#Nav: SVA_Contract_Garage/50011"/>
           <w:id w:val="786006919"/>
           <w:placeholder>
             <w:docPart w:val="DefaultPlaceholder_-1854013440"/>
           </w:placeholder>
-          <w:dataBinding w:prefixMappings="xmlns:ns0='urn:microsoft-dynamics-nav/reports/SVA Contract Garage/50011/'" w:xpath="/ns0:NavWordReportXmlPart[1]/ns0:LeaseContract_A9[1]/ns0:OName[1]" w:storeItemID="{1F734DEE-4130-4E5F-85C0-9541FA96340C}"/>
+          <w:dataBinding w:prefixMappings="xmlns:ns0='urn:microsoft-dynamics-nav/reports/SVA_Contract_Garage/50011/'" w:xpath="/ns0:NavWordReportXmlPart[1]/ns0:LeaseContract_A9[1]/ns0:OName[1]" w:storeItemID="{1F734DEE-4130-4E5F-85C0-9541FA96340C}"/>
           <w:text/>
         </w:sdtPr>
         <w:sdtEndPr/>
@@ -227,12 +227,12 @@
             <w:rFonts w:ascii="Arial" w:hAnsi="Arial" w:cs="Arial"/>
           </w:rPr>
           <w:alias w:val="#Nav: /LeaseContract_A9/Ocpr"/>
-          <w:tag w:val="#Nav: SVA Contract Garage/50011"/>
+          <w:tag w:val="#Nav: SVA_Contract_Garage/50011"/>
           <w:id w:val="775914562"/>
           <w:placeholder>
             <w:docPart w:val="DefaultPlaceholder_-1854013440"/>
           </w:placeholder>
-          <w:dataBinding w:prefixMappings="xmlns:ns0='urn:microsoft-dynamics-nav/reports/SVA Contract Garage/50011/'" w:xpath="/ns0:NavWordReportXmlPart[1]/ns0:LeaseContract_A9[1]/ns0:Ocpr[1]" w:storeItemID="{1F734DEE-4130-4E5F-85C0-9541FA96340C}"/>
+          <w:dataBinding w:prefixMappings="xmlns:ns0='urn:microsoft-dynamics-nav/reports/SVA_Contract_Garage/50011/'" w:xpath="/ns0:NavWordReportXmlPart[1]/ns0:LeaseContract_A9[1]/ns0:Ocpr[1]" w:storeItemID="{1F734DEE-4130-4E5F-85C0-9541FA96340C}"/>
           <w:text/>
         </w:sdtPr>
         <w:sdtEndPr/>
@@ -268,12 +268,12 @@
             <w:rFonts w:ascii="Arial" w:hAnsi="Arial" w:cs="Arial"/>
           </w:rPr>
           <w:alias w:val="#Nav: /LeaseContract_A9/OAddress"/>
-          <w:tag w:val="#Nav: SVA Contract Garage/50011"/>
+          <w:tag w:val="#Nav: SVA_Contract_Garage/50011"/>
           <w:id w:val="622737791"/>
           <w:placeholder>
             <w:docPart w:val="DefaultPlaceholder_-1854013440"/>
           </w:placeholder>
-          <w:dataBinding w:prefixMappings="xmlns:ns0='urn:microsoft-dynamics-nav/reports/SVA Contract Garage/50011/'" w:xpath="/ns0:NavWordReportXmlPart[1]/ns0:LeaseContract_A9[1]/ns0:OAddress[1]" w:storeItemID="{1F734DEE-4130-4E5F-85C0-9541FA96340C}"/>
+          <w:dataBinding w:prefixMappings="xmlns:ns0='urn:microsoft-dynamics-nav/reports/SVA_Contract_Garage/50011/'" w:xpath="/ns0:NavWordReportXmlPart[1]/ns0:LeaseContract_A9[1]/ns0:OAddress[1]" w:storeItemID="{1F734DEE-4130-4E5F-85C0-9541FA96340C}"/>
           <w:text/>
         </w:sdtPr>
         <w:sdtEndPr/>
@@ -328,12 +328,12 @@
             <w:rFonts w:ascii="Arial" w:hAnsi="Arial" w:cs="Arial"/>
           </w:rPr>
           <w:alias w:val="#Nav: /LeaseContract_A9/GarageNo"/>
-          <w:tag w:val="#Nav: SVA Contract Garage/50011"/>
+          <w:tag w:val="#Nav: SVA_Contract_Garage/50011"/>
           <w:id w:val="61526563"/>
           <w:placeholder>
             <w:docPart w:val="DefaultPlaceholder_-1854013440"/>
           </w:placeholder>
-          <w:dataBinding w:prefixMappings="xmlns:ns0='urn:microsoft-dynamics-nav/reports/SVA Contract Garage/50011/'" w:xpath="/ns0:NavWordReportXmlPart[1]/ns0:LeaseContract_A9[1]/ns0:GarageNo[1]" w:storeItemID="{1F734DEE-4130-4E5F-85C0-9541FA96340C}"/>
+          <w:dataBinding w:prefixMappings="xmlns:ns0='urn:microsoft-dynamics-nav/reports/SVA_Contract_Garage/50011/'" w:xpath="/ns0:NavWordReportXmlPart[1]/ns0:LeaseContract_A9[1]/ns0:GarageNo[1]" w:storeItemID="{1F734DEE-4130-4E5F-85C0-9541FA96340C}"/>
           <w:text/>
         </w:sdtPr>
         <w:sdtEndPr/>
@@ -369,12 +369,12 @@
             <w:rFonts w:ascii="Arial" w:hAnsi="Arial" w:cs="Arial"/>
           </w:rPr>
           <w:alias w:val="#Nav: /LeaseContract_A9/TAddress"/>
-          <w:tag w:val="#Nav: SVA Contract Garage/50011"/>
+          <w:tag w:val="#Nav: SVA_Contract_Garage/50011"/>
           <w:id w:val="-187527253"/>
           <w:placeholder>
             <w:docPart w:val="DefaultPlaceholder_-1854013440"/>
           </w:placeholder>
-          <w:dataBinding w:prefixMappings="xmlns:ns0='urn:microsoft-dynamics-nav/reports/SVA Contract Garage/50011/'" w:xpath="/ns0:NavWordReportXmlPart[1]/ns0:LeaseContract_A9[1]/ns0:TAddress[1]" w:storeItemID="{1F734DEE-4130-4E5F-85C0-9541FA96340C}"/>
+          <w:dataBinding w:prefixMappings="xmlns:ns0='urn:microsoft-dynamics-nav/reports/SVA_Contract_Garage/50011/'" w:xpath="/ns0:NavWordReportXmlPart[1]/ns0:LeaseContract_A9[1]/ns0:TAddress[1]" w:storeItemID="{1F734DEE-4130-4E5F-85C0-9541FA96340C}"/>
           <w:text/>
         </w:sdtPr>
         <w:sdtEndPr/>
@@ -399,12 +399,12 @@
             <w:rFonts w:ascii="Arial" w:hAnsi="Arial" w:cs="Arial"/>
           </w:rPr>
           <w:alias w:val="#Nav: /LeaseContract_A9/TCity"/>
-          <w:tag w:val="#Nav: SVA Contract Garage/50011"/>
+          <w:tag w:val="#Nav: SVA_Contract_Garage/50011"/>
           <w:id w:val="-427880898"/>
           <w:placeholder>
             <w:docPart w:val="DefaultPlaceholder_-1854013440"/>
           </w:placeholder>
-          <w:dataBinding w:prefixMappings="xmlns:ns0='urn:microsoft-dynamics-nav/reports/SVA Contract Garage/50011/'" w:xpath="/ns0:NavWordReportXmlPart[1]/ns0:LeaseContract_A9[1]/ns0:TCity[1]" w:storeItemID="{1F734DEE-4130-4E5F-85C0-9541FA96340C}"/>
+          <w:dataBinding w:prefixMappings="xmlns:ns0='urn:microsoft-dynamics-nav/reports/SVA_Contract_Garage/50011/'" w:xpath="/ns0:NavWordReportXmlPart[1]/ns0:LeaseContract_A9[1]/ns0:TCity[1]" w:storeItemID="{1F734DEE-4130-4E5F-85C0-9541FA96340C}"/>
           <w:text/>
         </w:sdtPr>
         <w:sdtEndPr/>
@@ -500,12 +500,12 @@
             <w:rFonts w:ascii="Arial" w:hAnsi="Arial" w:cs="Arial"/>
           </w:rPr>
           <w:alias w:val="#Nav: /LeaseContract_A9/StartDate"/>
-          <w:tag w:val="#Nav: SVA Contract Garage/50011"/>
+          <w:tag w:val="#Nav: SVA_Contract_Garage/50011"/>
           <w:id w:val="651953255"/>
           <w:placeholder>
             <w:docPart w:val="DefaultPlaceholder_-1854013440"/>
           </w:placeholder>
-          <w:dataBinding w:prefixMappings="xmlns:ns0='urn:microsoft-dynamics-nav/reports/SVA Contract Garage/50011/'" w:xpath="/ns0:NavWordReportXmlPart[1]/ns0:LeaseContract_A9[1]/ns0:StartDate[1]" w:storeItemID="{1F734DEE-4130-4E5F-85C0-9541FA96340C}"/>
+          <w:dataBinding w:prefixMappings="xmlns:ns0='urn:microsoft-dynamics-nav/reports/SVA_Contract_Garage/50011/'" w:xpath="/ns0:NavWordReportXmlPart[1]/ns0:LeaseContract_A9[1]/ns0:StartDate[1]" w:storeItemID="{1F734DEE-4130-4E5F-85C0-9541FA96340C}"/>
           <w:text/>
         </w:sdtPr>
         <w:sdtEndPr/>
@@ -566,12 +566,12 @@
             <w:rFonts w:ascii="Arial" w:hAnsi="Arial" w:cs="Arial"/>
           </w:rPr>
           <w:alias w:val="#Nav: /LeaseContract_A9/RentPrYr"/>
-          <w:tag w:val="#Nav: SVA Contract Garage/50011"/>
+          <w:tag w:val="#Nav: SVA_Contract_Garage/50011"/>
           <w:id w:val="-1351251969"/>
           <w:placeholder>
             <w:docPart w:val="DefaultPlaceholder_-1854013440"/>
           </w:placeholder>
-          <w:dataBinding w:prefixMappings="xmlns:ns0='urn:microsoft-dynamics-nav/reports/SVA Contract Garage/50011/'" w:xpath="/ns0:NavWordReportXmlPart[1]/ns0:LeaseContract_A9[1]/ns0:RentPrYr[1]" w:storeItemID="{1F734DEE-4130-4E5F-85C0-9541FA96340C}"/>
+          <w:dataBinding w:prefixMappings="xmlns:ns0='urn:microsoft-dynamics-nav/reports/SVA_Contract_Garage/50011/'" w:xpath="/ns0:NavWordReportXmlPart[1]/ns0:LeaseContract_A9[1]/ns0:RentPrYr[1]" w:storeItemID="{1F734DEE-4130-4E5F-85C0-9541FA96340C}"/>
           <w:text/>
         </w:sdtPr>
         <w:sdtEndPr/>
@@ -602,12 +602,12 @@
             <w:rFonts w:ascii="Arial" w:hAnsi="Arial" w:cs="Arial"/>
           </w:rPr>
           <w:alias w:val="#Nav: /LeaseContract_A9/RentPPeriod"/>
-          <w:tag w:val="#Nav: SVA Contract Garage/50011"/>
+          <w:tag w:val="#Nav: SVA_Contract_Garage/50011"/>
           <w:id w:val="105090034"/>
           <w:placeholder>
             <w:docPart w:val="DefaultPlaceholder_-1854013440"/>
           </w:placeholder>
-          <w:dataBinding w:prefixMappings="xmlns:ns0='urn:microsoft-dynamics-nav/reports/SVA Contract Garage/50011/'" w:xpath="/ns0:NavWordReportXmlPart[1]/ns0:LeaseContract_A9[1]/ns0:RentPPeriod[1]" w:storeItemID="{1F734DEE-4130-4E5F-85C0-9541FA96340C}"/>
+          <w:dataBinding w:prefixMappings="xmlns:ns0='urn:microsoft-dynamics-nav/reports/SVA_Contract_Garage/50011/'" w:xpath="/ns0:NavWordReportXmlPart[1]/ns0:LeaseContract_A9[1]/ns0:RentPPeriod[1]" w:storeItemID="{1F734DEE-4130-4E5F-85C0-9541FA96340C}"/>
           <w:text/>
         </w:sdtPr>
         <w:sdtEndPr/>
@@ -638,12 +638,12 @@
             <w:rFonts w:ascii="Arial" w:hAnsi="Arial" w:cs="Arial"/>
           </w:rPr>
           <w:alias w:val="#Nav: /LeaseContract_A9/Bankname"/>
-          <w:tag w:val="#Nav: SVA Contract Garage/50011"/>
+          <w:tag w:val="#Nav: SVA_Contract_Garage/50011"/>
           <w:id w:val="-1630545596"/>
           <w:placeholder>
             <w:docPart w:val="DefaultPlaceholder_-1854013440"/>
           </w:placeholder>
-          <w:dataBinding w:prefixMappings="xmlns:ns0='urn:microsoft-dynamics-nav/reports/SVA Contract Garage/50011/'" w:xpath="/ns0:NavWordReportXmlPart[1]/ns0:LeaseContract_A9[1]/ns0:Bankname[1]" w:storeItemID="{1F734DEE-4130-4E5F-85C0-9541FA96340C}"/>
+          <w:dataBinding w:prefixMappings="xmlns:ns0='urn:microsoft-dynamics-nav/reports/SVA_Contract_Garage/50011/'" w:xpath="/ns0:NavWordReportXmlPart[1]/ns0:LeaseContract_A9[1]/ns0:Bankname[1]" w:storeItemID="{1F734DEE-4130-4E5F-85C0-9541FA96340C}"/>
           <w:text/>
         </w:sdtPr>
         <w:sdtEndPr/>
@@ -680,12 +680,12 @@
             <w:rFonts w:ascii="Arial" w:hAnsi="Arial" w:cs="Arial"/>
           </w:rPr>
           <w:alias w:val="#Nav: /LeaseContract_A9/BankRegNo"/>
-          <w:tag w:val="#Nav: SVA Contract Garage/50011"/>
+          <w:tag w:val="#Nav: SVA_Contract_Garage/50011"/>
           <w:id w:val="1841657578"/>
           <w:placeholder>
             <w:docPart w:val="DefaultPlaceholder_-1854013440"/>
           </w:placeholder>
-          <w:dataBinding w:prefixMappings="xmlns:ns0='urn:microsoft-dynamics-nav/reports/SVA Contract Garage/50011/'" w:xpath="/ns0:NavWordReportXmlPart[1]/ns0:LeaseContract_A9[1]/ns0:BankRegNo[1]" w:storeItemID="{1F734DEE-4130-4E5F-85C0-9541FA96340C}"/>
+          <w:dataBinding w:prefixMappings="xmlns:ns0='urn:microsoft-dynamics-nav/reports/SVA_Contract_Garage/50011/'" w:xpath="/ns0:NavWordReportXmlPart[1]/ns0:LeaseContract_A9[1]/ns0:BankRegNo[1]" w:storeItemID="{1F734DEE-4130-4E5F-85C0-9541FA96340C}"/>
           <w:text/>
         </w:sdtPr>
         <w:sdtEndPr/>
@@ -710,12 +710,12 @@
             <w:rFonts w:ascii="Arial" w:hAnsi="Arial" w:cs="Arial"/>
           </w:rPr>
           <w:alias w:val="#Nav: /LeaseContract_A9/BankAccount"/>
-          <w:tag w:val="#Nav: SVA Contract Garage/50011"/>
+          <w:tag w:val="#Nav: SVA_Contract_Garage/50011"/>
           <w:id w:val="1252865102"/>
           <w:placeholder>
             <w:docPart w:val="DefaultPlaceholder_-1854013440"/>
           </w:placeholder>
-          <w:dataBinding w:prefixMappings="xmlns:ns0='urn:microsoft-dynamics-nav/reports/SVA Contract Garage/50011/'" w:xpath="/ns0:NavWordReportXmlPart[1]/ns0:LeaseContract_A9[1]/ns0:BankAccount[1]" w:storeItemID="{1F734DEE-4130-4E5F-85C0-9541FA96340C}"/>
+          <w:dataBinding w:prefixMappings="xmlns:ns0='urn:microsoft-dynamics-nav/reports/SVA_Contract_Garage/50011/'" w:xpath="/ns0:NavWordReportXmlPart[1]/ns0:LeaseContract_A9[1]/ns0:BankAccount[1]" w:storeItemID="{1F734DEE-4130-4E5F-85C0-9541FA96340C}"/>
           <w:text/>
         </w:sdtPr>
         <w:sdtEndPr/>
@@ -760,12 +760,12 @@
             <w:rFonts w:ascii="Arial" w:hAnsi="Arial" w:cs="Arial"/>
           </w:rPr>
           <w:alias w:val="#Nav: /LeaseContract_A9/Rent"/>
-          <w:tag w:val="#Nav: SVA Contract Garage/50011"/>
+          <w:tag w:val="#Nav: SVA_Contract_Garage/50011"/>
           <w:id w:val="661744329"/>
           <w:placeholder>
             <w:docPart w:val="DefaultPlaceholder_-1854013440"/>
           </w:placeholder>
-          <w:dataBinding w:prefixMappings="xmlns:ns0='urn:microsoft-dynamics-nav/reports/SVA Contract Garage/50011/'" w:xpath="/ns0:NavWordReportXmlPart[1]/ns0:LeaseContract_A9[1]/ns0:Rent[1]" w:storeItemID="{1F734DEE-4130-4E5F-85C0-9541FA96340C}"/>
+          <w:dataBinding w:prefixMappings="xmlns:ns0='urn:microsoft-dynamics-nav/reports/SVA_Contract_Garage/50011/'" w:xpath="/ns0:NavWordReportXmlPart[1]/ns0:LeaseContract_A9[1]/ns0:Rent[1]" w:storeItemID="{1F734DEE-4130-4E5F-85C0-9541FA96340C}"/>
           <w:text/>
         </w:sdtPr>
         <w:sdtEndPr/>
@@ -790,12 +790,12 @@
             <w:rFonts w:ascii="Arial" w:hAnsi="Arial" w:cs="Arial"/>
           </w:rPr>
           <w:alias w:val="#Nav: /LeaseContract_A9/RentFrom"/>
-          <w:tag w:val="#Nav: SVA Contract Garage/50011"/>
+          <w:tag w:val="#Nav: SVA_Contract_Garage/50011"/>
           <w:id w:val="607395331"/>
           <w:placeholder>
             <w:docPart w:val="DefaultPlaceholder_-1854013440"/>
           </w:placeholder>
-          <w:dataBinding w:prefixMappings="xmlns:ns0='urn:microsoft-dynamics-nav/reports/SVA Contract Garage/50011/'" w:xpath="/ns0:NavWordReportXmlPart[1]/ns0:LeaseContract_A9[1]/ns0:RentFrom[1]" w:storeItemID="{1F734DEE-4130-4E5F-85C0-9541FA96340C}"/>
+          <w:dataBinding w:prefixMappings="xmlns:ns0='urn:microsoft-dynamics-nav/reports/SVA_Contract_Garage/50011/'" w:xpath="/ns0:NavWordReportXmlPart[1]/ns0:LeaseContract_A9[1]/ns0:RentFrom[1]" w:storeItemID="{1F734DEE-4130-4E5F-85C0-9541FA96340C}"/>
           <w:text/>
         </w:sdtPr>
         <w:sdtEndPr/>
@@ -820,12 +820,12 @@
             <w:rFonts w:ascii="Arial" w:hAnsi="Arial" w:cs="Arial"/>
           </w:rPr>
           <w:alias w:val="#Nav: /LeaseContract_A9/RentTo"/>
-          <w:tag w:val="#Nav: SVA Contract Garage/50011"/>
+          <w:tag w:val="#Nav: SVA_Contract_Garage/50011"/>
           <w:id w:val="-1749261886"/>
           <w:placeholder>
             <w:docPart w:val="DefaultPlaceholder_-1854013440"/>
           </w:placeholder>
-          <w:dataBinding w:prefixMappings="xmlns:ns0='urn:microsoft-dynamics-nav/reports/SVA Contract Garage/50011/'" w:xpath="/ns0:NavWordReportXmlPart[1]/ns0:LeaseContract_A9[1]/ns0:RentTo[1]" w:storeItemID="{1F734DEE-4130-4E5F-85C0-9541FA96340C}"/>
+          <w:dataBinding w:prefixMappings="xmlns:ns0='urn:microsoft-dynamics-nav/reports/SVA_Contract_Garage/50011/'" w:xpath="/ns0:NavWordReportXmlPart[1]/ns0:LeaseContract_A9[1]/ns0:RentTo[1]" w:storeItemID="{1F734DEE-4130-4E5F-85C0-9541FA96340C}"/>
           <w:text/>
         </w:sdtPr>
         <w:sdtEndPr/>
@@ -856,12 +856,12 @@
             <w:rFonts w:ascii="Arial" w:hAnsi="Arial" w:cs="Arial"/>
           </w:rPr>
           <w:alias w:val="#Nav: /LeaseContract_A9/RentFirstTime"/>
-          <w:tag w:val="#Nav: SVA Contract Garage/50011"/>
+          <w:tag w:val="#Nav: SVA_Contract_Garage/50011"/>
           <w:id w:val="-1575194668"/>
           <w:placeholder>
             <w:docPart w:val="DefaultPlaceholder_-1854013440"/>
           </w:placeholder>
-          <w:dataBinding w:prefixMappings="xmlns:ns0='urn:microsoft-dynamics-nav/reports/SVA Contract Garage/50011/'" w:xpath="/ns0:NavWordReportXmlPart[1]/ns0:LeaseContract_A9[1]/ns0:RentFirstTime[1]" w:storeItemID="{1F734DEE-4130-4E5F-85C0-9541FA96340C}"/>
+          <w:dataBinding w:prefixMappings="xmlns:ns0='urn:microsoft-dynamics-nav/reports/SVA_Contract_Garage/50011/'" w:xpath="/ns0:NavWordReportXmlPart[1]/ns0:LeaseContract_A9[1]/ns0:RentFirstTime[1]" w:storeItemID="{1F734DEE-4130-4E5F-85C0-9541FA96340C}"/>
           <w:text/>
         </w:sdtPr>
         <w:sdtEndPr/>
@@ -959,12 +959,12 @@
             <w:rFonts w:ascii="Arial" w:hAnsi="Arial" w:cs="Arial"/>
           </w:rPr>
           <w:alias w:val="#Nav: /LeaseContract_A9/DepAmount"/>
-          <w:tag w:val="#Nav: SVA Contract Garage/50011"/>
+          <w:tag w:val="#Nav: SVA_Contract_Garage/50011"/>
           <w:id w:val="1992834954"/>
           <w:placeholder>
             <w:docPart w:val="DefaultPlaceholder_-1854013440"/>
           </w:placeholder>
-          <w:dataBinding w:prefixMappings="xmlns:ns0='urn:microsoft-dynamics-nav/reports/SVA Contract Garage/50011/'" w:xpath="/ns0:NavWordReportXmlPart[1]/ns0:LeaseContract_A9[1]/ns0:DepAmount[1]" w:storeItemID="{1F734DEE-4130-4E5F-85C0-9541FA96340C}"/>
+          <w:dataBinding w:prefixMappings="xmlns:ns0='urn:microsoft-dynamics-nav/reports/SVA_Contract_Garage/50011/'" w:xpath="/ns0:NavWordReportXmlPart[1]/ns0:LeaseContract_A9[1]/ns0:DepAmount[1]" w:storeItemID="{1F734DEE-4130-4E5F-85C0-9541FA96340C}"/>
           <w:text/>
         </w:sdtPr>
         <w:sdtEndPr/>
@@ -1301,12 +1301,12 @@
           <w:szCs w:val="24"/>
         </w:rPr>
         <w:alias w:val="#Nav: /LeaseContract_A9/Number"/>
-        <w:tag w:val="#Nav: SVA Contract Garage/50011"/>
+        <w:tag w:val="#Nav: SVA_Contract_Garage/50011"/>
         <w:id w:val="1986662914"/>
         <w:placeholder>
           <w:docPart w:val="DefaultPlaceholder_-1854013440"/>
         </w:placeholder>
-        <w:dataBinding w:prefixMappings="xmlns:ns0='urn:microsoft-dynamics-nav/reports/SVA Contract Garage/50011/'" w:xpath="/ns0:NavWordReportXmlPart[1]/ns0:LeaseContract_A9[1]/ns0:Number[1]" w:storeItemID="{1F734DEE-4130-4E5F-85C0-9541FA96340C}"/>
+        <w:dataBinding w:prefixMappings="xmlns:ns0='urn:microsoft-dynamics-nav/reports/SVA_Contract_Garage/50011/'" w:xpath="/ns0:NavWordReportXmlPart[1]/ns0:LeaseContract_A9[1]/ns0:Number[1]" w:storeItemID="{1F734DEE-4130-4E5F-85C0-9541FA96340C}"/>
         <w:text/>
       </w:sdtPr>
       <w:sdtEndPr/>
@@ -2886,7 +2886,7 @@
 
 <file path=customXML/item2.xml>��< ? x m l   v e r s i o n = " 1 . 0 "   e n c o d i n g = " u t f - 1 6 " ? >   
- < N a v W o r d R e p o r t X m l P a r t   x m l n s = " u r n : m i c r o s o f t - d y n a m i c s - n a v / r e p o r t s / S V A   C o n t r a c t   G a r a g e / 5 0 0 1 1 / " > + < N a v W o r d R e p o r t X m l P a r t   x m l n s = " u r n : m i c r o s o f t - d y n a m i c s - n a v / r e p o r t s / S V A _ C o n t r a c t _ G a r a g e / 5 0 0 1 1 / " >   
      < L e a s e C o n t r a c t _ A 9 >   

</xml_diff>